<commit_message>
PDE5 v3.0 2차 리뷰 반영 (2026 리포 d7e973c 미러)
프로토콜 대조 실행: 옛 30건을 새 프로토콜로 재도킹, 점수 상관 +0.997 로
프로토콜은 원인이 아님을 확정. 원인은 화합물 집합.
과잉 주장 격하: 점수-Tanimoto 상관 p=0.158(유의하지 않음), near AUC 를 가설로,
MCS-RMSD 의 타당성 가정 명시, Figure 14 의 철회된 주장 교체.

Co-Authored-By: Claude Opus 5 <noreply@anthropic.com>
Claude-Session: https://claude.ai/code/session_01F7Su8jZ8JQgL7EgY5Mmaqy
</commit_message>
<xml_diff>
--- a/20260905/pde5_harness/sample_run/report/docs/report_controlled.docx
+++ b/20260905/pde5_harness/sample_run/report/docs/report_controlled.docx
@@ -73,7 +73,7 @@
           <w:b w:val="0"/>
           <w:sz w:val="21"/>
         </w:rPr>
-        <w:t xml:space="preserve"> sample_run/ (dataset ff01d67b6c7541a2, docking 2992a361c9e0e845, analysis 1dcb3ca9edf11a9e)</w:t>
+        <w:t xml:space="preserve"> sample_run/ (dataset ff01d67b6c7541a2, docking 2992a361c9e0e845, analysis 72b035e592fee370)</w:t>
       </w:r>
     </w:p>
     <w:p>
@@ -334,7 +334,7 @@
           <w:b/>
           <w:sz w:val="21"/>
         </w:rPr>
-        <w:t>결정 구조와 같은 계열 안에서는 신호가 남는다</w:t>
+        <w:t>결정 구조와 같은 계열(near 대역) 안에서는 신호가 남는다</w:t>
       </w:r>
       <w:r>
         <w:rPr>
@@ -342,7 +342,23 @@
           <w:b w:val="0"/>
           <w:sz w:val="21"/>
         </w:rPr>
-        <w:t xml:space="preserve"> (near 대역 ρ = -0.397, p = 0.00365, AUC 0.792) — 채점 함수는 구조가 유래한 화학형 안에서만 작동한다. 정량 예측은 사전 기준(Q² ≥ 0.3)을 충족하지 못했다.</w:t>
+        <w:t xml:space="preserve"> (ρ = -0.397, p = 0.00365, AUC 0.792). </w:t>
+      </w:r>
+      <w:r>
+        <w:rPr>
+          <w:rFonts w:ascii="Malgun Gothic" w:hAnsi="Malgun Gothic"/>
+          <w:b/>
+          <w:sz w:val="21"/>
+        </w:rPr>
+        <w:t>이 결과는 가설로만 남긴다</w:t>
+      </w:r>
+      <w:r>
+        <w:rPr>
+          <w:rFonts w:ascii="Malgun Gothic" w:hAnsi="Malgun Gothic"/>
+          <w:b w:val="0"/>
+          <w:sz w:val="21"/>
+        </w:rPr>
+        <w:t xml:space="preserve"> — 그 대역의 약한 화합물 12건이 전수(census)이고 어세이 바닥값에 몰려 있어, 그 칸을 빼면 상관이 유의하지 않고 AUC 는 계산조차 되지 않는다. 정량 예측은 사전 기준(Q² ≥ 0.3)을 충족하지 못했다.</w:t>
       </w:r>
     </w:p>
     <w:p>
@@ -368,7 +384,7 @@
           <w:b/>
           <w:sz w:val="21"/>
         </w:rPr>
-        <w:t>0.8%</w:t>
+        <w:t>1.2%</w:t>
       </w:r>
       <w:r>
         <w:rPr>
@@ -376,7 +392,7 @@
           <w:b w:val="0"/>
           <w:sz w:val="21"/>
         </w:rPr>
-        <w:t xml:space="preserve"> 에 불과하고, 옛 데이터의 점수-Tanimoto 상관은 -0.125 (p=0.50747)로 관계 자체가 없다. 옛 설계를 새 데이터에 재현해도 상관은 중앙값 -0.148 에 그친다. 데이터가 지지하는 진술은 하나다 — </w:t>
+        <w:t xml:space="preserve"> 에 불과하고, 옛 데이터의 점수-Tanimoto 상관은 -0.131 (p=0.48923)로 관계 자체가 없다. 옛 설계를 새 데이터에 재현해도 상관은 중앙값 -0.148 에 그친다. 데이터가 지지하는 진술은 하나다 — </w:t>
       </w:r>
       <w:r>
         <w:rPr>
@@ -384,7 +400,31 @@
           <w:b/>
           <w:sz w:val="21"/>
         </w:rPr>
-        <w:t>n=30 의 상관은 더 큰 표본에서 재현되지 않았고, 그 차이의 원인을 우리는 특정하지 못한다.</w:t>
+        <w:t>n=30 의 상관은 더 큰 표본에서 재현되지 않았다.</w:t>
+      </w:r>
+      <w:r>
+        <w:rPr>
+          <w:rFonts w:ascii="Malgun Gothic" w:hAnsi="Malgun Gothic"/>
+          <w:b w:val="0"/>
+          <w:sz w:val="21"/>
+        </w:rPr>
+        <w:t xml:space="preserve"> 옛 30건을 새 프로토콜로 다시 도킹해도 상관이 유지되므로(ρ=-0.527) 원인은 프로토콜이 아니라 </w:t>
+      </w:r>
+      <w:r>
+        <w:rPr>
+          <w:rFonts w:ascii="Malgun Gothic" w:hAnsi="Malgun Gothic"/>
+          <w:b/>
+          <w:sz w:val="21"/>
+        </w:rPr>
+        <w:t>그 화합물 집합 자체</w:t>
+      </w:r>
+      <w:r>
+        <w:rPr>
+          <w:rFonts w:ascii="Malgun Gothic" w:hAnsi="Malgun Gothic"/>
+          <w:b w:val="0"/>
+          <w:sz w:val="21"/>
+        </w:rPr>
+        <w:t>다.</w:t>
       </w:r>
     </w:p>
     <w:p>
@@ -711,7 +751,23 @@
           <w:b w:val="0"/>
           <w:sz w:val="21"/>
         </w:rPr>
-        <w:t xml:space="preserve"> 받아 2538개 레코드를 얻었다. 화합물당 pChEMBL 중앙값 (반복 측정 병합) — 반복 측정을 버리지 않고 중앙값으로 합쳐 어세이 잡음을 줄였다. 중원자 12–70개 범위로 걸러 2158종의 풀을 만들었다.</w:t>
+        <w:t xml:space="preserve"> 받아 2538개 레코드를 얻었다. 화합물당 pChEMBL 중앙값 (반복 측정 병합). 다만 </w:t>
+      </w:r>
+      <w:r>
+        <w:rPr>
+          <w:rFonts w:ascii="Malgun Gothic" w:hAnsi="Malgun Gothic"/>
+          <w:b/>
+          <w:sz w:val="21"/>
+        </w:rPr>
+        <w:t>실제로 합쳐진 것은 9건뿐이고 154건은 측정이 하나씩이다</w:t>
+      </w:r>
+      <w:r>
+        <w:rPr>
+          <w:rFonts w:ascii="Malgun Gothic" w:hAnsi="Malgun Gothic"/>
+          <w:b w:val="0"/>
+          <w:sz w:val="21"/>
+        </w:rPr>
+        <w:t xml:space="preserve"> — 집계가 잡음에 준 영향은 작다. 어세이 종류는 IC50 158건 · Ki 4건 · IC50/Ki 1건 이며, near 대역은 IC50 52건 로 균일하다. 중원자 12–70개 범위로 걸러 2158종의 풀을 만들었다.</w:t>
       </w:r>
     </w:p>
     <w:p>
@@ -1448,7 +1504,7 @@
           <w:b w:val="0"/>
           <w:sz w:val="21"/>
         </w:rPr>
-        <w:t xml:space="preserve"> 역가로만 층화한 n=30 세트에서 같은 상관은 Pearson +0.281 (p=0.132, 유의하지 않음) · Spearman +0.366 이었다. 즉 옛 설계도 두 축이 "사실상 같은 축" 이었다고 말할 정도는 아니었고, 이 사실이 §3.5 의 검정 결과와 일관된다.</w:t>
+        <w:t xml:space="preserve"> 역가로만 층화한 n=30 세트에서 같은 상관은 Spearman +0.366 였다. 즉 옛 설계도 두 축이 "사실상 같은 축" 이었다고 말할 정도는 아니었고, 이 사실이 §3.5 의 검정 결과와 일관된다.</w:t>
       </w:r>
     </w:p>
     <w:p>
@@ -1710,7 +1766,7 @@
           <w:b w:val="0"/>
           <w:sz w:val="21"/>
         </w:rPr>
-        <w:t xml:space="preserve">로 구했다 — y 를 통째로 섞으면 역가와 Tanimoto 의 관계까지 깨져 검정하려는 귀무가설("점수가 골격 정보 너머의 정보를 주지 않는다")과 달라지므로, Tanimoto 로 회귀한 잔차만 섞고 적합값은 보존한다. 단순 섞기와의 차이도 모의 데이터로 확인했으며 두 절차의 p 값 차이는 0.004 이하였다 (statistics_validation.json). 이 통계 함수들은 외부 의존 없이 직접 구현했으므로, </w:t>
+        <w:t xml:space="preserve">로 구했다 — y 를 통째로 섞으면 역가와 Tanimoto 의 관계까지 깨져 검정하려는 귀무가설("점수가 골격 정보 너머의 정보를 주지 않는다")과 달라지므로, Tanimoto 로 회귀한 잔차만 섞고 적합값은 보존한다. 단순 섞기와의 차이도 모의 데이터로 확인했으며 두 절차의 p 값 차이는 최대 0.0043 였다 (statistics_validation.json). 이 통계 함수들은 외부 의존 없이 직접 구현했으므로, </w:t>
       </w:r>
       <w:r>
         <w:rPr>
@@ -1718,7 +1774,7 @@
           <w:b/>
           <w:sz w:val="21"/>
         </w:rPr>
-        <w:t>동점을 의도적으로 주입한 무작위 데이터 400회로 scipy.stats 와 대조해 일치를 확인했다</w:t>
+        <w:t>동점을 의도적으로 주입한 무작위 데이터 550회로 scipy.stats 와 대조해 일치를 확인했다</w:t>
       </w:r>
       <w:r>
         <w:rPr>
@@ -1840,7 +1896,23 @@
           <w:b w:val="0"/>
           <w:sz w:val="21"/>
         </w:rPr>
-        <w:t>이 연구는 이전 판(n=30, 역가로만 층화)의 결론이 골격 교란으로 해석 불가능함을 확인하고 다시 설계한 것이다. 그 경위는 §개정 이력에 적었다.</w:t>
+        <w:t xml:space="preserve">이 연구는 이전 판(n=30, 역가로만 층화)의 표본에 역가와 골격이 얽혀 있다는 </w:t>
+      </w:r>
+      <w:r>
+        <w:rPr>
+          <w:rFonts w:ascii="Malgun Gothic" w:hAnsi="Malgun Gothic"/>
+          <w:b/>
+          <w:sz w:val="21"/>
+        </w:rPr>
+        <w:t>우려</w:t>
+      </w:r>
+      <w:r>
+        <w:rPr>
+          <w:rFonts w:ascii="Malgun Gothic" w:hAnsi="Malgun Gothic"/>
+          <w:b w:val="0"/>
+          <w:sz w:val="21"/>
+        </w:rPr>
+        <w:t>에서 다시 설계한 것이다. 그 우려 자체가 검정 결과 근거가 없었다는 사실은 §3.5 에 있고, 경위는 §개정 이력에 적었다.</w:t>
       </w:r>
     </w:p>
     <w:p>
@@ -2905,7 +2977,7 @@
           <w:b w:val="0"/>
           <w:sz w:val="21"/>
         </w:rPr>
-        <w:t xml:space="preserve"> 시드 [42, 7, 2024] 평균. 요청 모드 수는 전 조건 20개이나 smina 가 실제로 반환한 모드 수는 조건마다 18–20개로 달랐다. C1 은 "상위 모드 중 최선"이라 모드 수에 민감하므로 C1 은 "상위 모드 중 최선"이므로 모드 수를 늘리면 값이 좋아진다 — 따라서 이 표의 C1 은 §3.2 상단 대조(9개 모드)와 직접 비교하지 말고, </w:t>
+        <w:t xml:space="preserve"> 시드 [42, 7, 2024] 평균. 요청 모드 수는 전 조건 20개이나 smina 가 실제로 반환한 모드 수는 조건마다 18–20개로 달랐다. C1 은 "상위 모드 중 최선"이라 모드 수가 늘면 값이 좋아진다. 따라서 이 표의 C1 은 §3.2 상단 대조(9개 모드)와 직접 비교하지 말고 </w:t>
       </w:r>
       <w:r>
         <w:rPr>
@@ -2949,7 +3021,7 @@
           <w:b w:val="0"/>
           <w:sz w:val="21"/>
         </w:rPr>
-        <w:t xml:space="preserve"> C1 은 2.97 Å (통과율 0%)에서 1.09 Å (통과율 100%)로 단조 개선된다. 깊이 32 이상에서는 모든 시드가 결정 자세를 상위 모드 안에 재현한다.</w:t>
+        <w:t xml:space="preserve"> C1 은 2.97 Å (통과율 0%)에서 1.09 Å (통과율 100%)로 개선된다 (마지막 구간 64→128 에서는 1.068→1.086 Å 로 미세하게 뒤집히므로 엄밀히 단조는 아니다). 깊이 32 이상에서는 모든 시드가 결정 자세를 상위 모드 안에 재현한다.</w:t>
       </w:r>
     </w:p>
     <w:p>
@@ -6084,7 +6156,7 @@
                 <w:b w:val="0"/>
                 <w:sz w:val="17"/>
               </w:rPr>
-              <w:t>-0.538 → -0.534 (감쇠 0.8%)</w:t>
+              <w:t>-0.538 → -0.532 (감쇠 1.2%)</w:t>
             </w:r>
           </w:p>
         </w:tc>
@@ -6131,7 +6203,7 @@
                 <w:b w:val="0"/>
                 <w:sz w:val="17"/>
               </w:rPr>
-              <w:t>-0.125 (p=0.50747)</w:t>
+              <w:t>-0.131 (p=0.48923)</w:t>
             </w:r>
           </w:p>
         </w:tc>
@@ -6241,6 +6313,53 @@
                 <w:sz w:val="17"/>
               </w:rPr>
               <w:t>표본 크기만의 효과 참조값</w:t>
+            </w:r>
+          </w:p>
+        </w:tc>
+      </w:tr>
+      <w:tr>
+        <w:tc>
+          <w:tcPr>
+            <w:tcW w:type="dxa" w:w="2880"/>
+          </w:tcPr>
+          <w:p>
+            <w:r>
+              <w:rPr>
+                <w:rFonts w:ascii="Malgun Gothic" w:hAnsi="Malgun Gothic"/>
+                <w:b w:val="0"/>
+                <w:sz w:val="17"/>
+              </w:rPr>
+              <w:t>⑤ 옛 30건을 새 프로토콜로 재도킹</w:t>
+            </w:r>
+          </w:p>
+        </w:tc>
+        <w:tc>
+          <w:tcPr>
+            <w:tcW w:type="dxa" w:w="2880"/>
+          </w:tcPr>
+          <w:p>
+            <w:r>
+              <w:rPr>
+                <w:rFonts w:ascii="Malgun Gothic" w:hAnsi="Malgun Gothic"/>
+                <w:b w:val="0"/>
+                <w:sz w:val="17"/>
+              </w:rPr>
+              <w:t>-0.538 → -0.527 (p=0.0033)</w:t>
+            </w:r>
+          </w:p>
+        </w:tc>
+        <w:tc>
+          <w:tcPr>
+            <w:tcW w:type="dxa" w:w="2880"/>
+          </w:tcPr>
+          <w:p>
+            <w:r>
+              <w:rPr>
+                <w:rFonts w:ascii="Malgun Gothic" w:hAnsi="Malgun Gothic"/>
+                <w:b w:val="0"/>
+                <w:sz w:val="17"/>
+              </w:rPr>
+              <w:t>프로토콜은 원인이 아니다</w:t>
             </w:r>
           </w:p>
         </w:tc>
@@ -6271,17 +6390,41 @@
           <w:b w:val="0"/>
           <w:sz w:val="21"/>
         </w:rPr>
-        <w:t>두 세트의 공통 화합물은 3건뿐이라 프로토콜 차이(탐색 깊이 16 → 64, 자세 규칙, 반복측정 집계)를 직접 비교할 수 없었다.</w:t>
+        <w:t xml:space="preserve">두 세트의 공통 화합물이 3건뿐이라 프로토콜 비교가 막혔으므로, </w:t>
+      </w:r>
+      <w:r>
+        <w:rPr>
+          <w:rFonts w:ascii="Malgun Gothic" w:hAnsi="Malgun Gothic"/>
+          <w:b/>
+          <w:sz w:val="21"/>
+        </w:rPr>
+        <w:t>옛 30건을 새 프로토콜로 그대로 다시 도킹했다</w:t>
+      </w:r>
+      <w:r>
+        <w:rPr>
+          <w:rFonts w:ascii="Malgun Gothic" w:hAnsi="Malgun Gothic"/>
+          <w:b w:val="0"/>
+          <w:sz w:val="21"/>
+        </w:rPr>
+        <w:t xml:space="preserve"> (검정 ⑤).</w:t>
       </w:r>
     </w:p>
     <w:p>
       <w:r>
         <w:rPr>
           <w:rFonts w:ascii="Malgun Gothic" w:hAnsi="Malgun Gothic"/>
+          <w:b w:val="0"/>
+          <w:sz w:val="21"/>
+        </w:rPr>
+        <w:t xml:space="preserve">결과는 명확하다. 두 프로토콜의 점수 상관은 </w:t>
+      </w:r>
+      <w:r>
+        <w:rPr>
+          <w:rFonts w:ascii="Malgun Gothic" w:hAnsi="Malgun Gothic"/>
           <w:b/>
           <w:sz w:val="21"/>
         </w:rPr>
-        <w:t>따라서 원인을 특정하지 못한다.</w:t>
+        <w:t>+0.997</w:t>
       </w:r>
       <w:r>
         <w:rPr>
@@ -6289,7 +6432,7 @@
           <w:b w:val="0"/>
           <w:sz w:val="21"/>
         </w:rPr>
-        <w:t xml:space="preserve"> 남은 후보는 화합물 집합 자체와 프로토콜 차이이며 이 데이터로는 나눌 수 없다. 데이터가 지지하는 진술은 </w:t>
+        <w:t xml:space="preserve">, 평균 점수 이동은 +0.000 kcal/mol 이다. 탐색 깊이를 4배로 올리고 자세 규칙을 바꿔도 점수가 사실상 동일하며, 역가와의 상관도 -0.538 → -0.527 로 유지된다. </w:t>
       </w:r>
       <w:r>
         <w:rPr>
@@ -6297,7 +6440,17 @@
           <w:b/>
           <w:sz w:val="21"/>
         </w:rPr>
-        <w:t>"n=30 의 상관은 더 큰 독립 표본에서 재현되지 않았다"</w:t>
+        <w:t>따라서 프로토콜은 원인이 아니다. 원인은 화합물 집합이다.</w:t>
+      </w:r>
+    </w:p>
+    <w:p>
+      <w:r>
+        <w:rPr>
+          <w:rFonts w:ascii="Malgun Gothic" w:hAnsi="Malgun Gothic"/>
+          <w:b/>
+          <w:sz w:val="21"/>
+        </w:rPr>
+        <w:t>그리고 그 집합에서 자세는 오히려 더 나쁘다.</w:t>
       </w:r>
       <w:r>
         <w:rPr>
@@ -6305,7 +6458,57 @@
           <w:b w:val="0"/>
           <w:sz w:val="21"/>
         </w:rPr>
-        <w:t xml:space="preserve"> 까지다. 이 절은 본 보고서 초안의 인과 주장을 철회한 기록이다.</w:t>
+        <w:t xml:space="preserve"> 옛 30건을 새 프로토콜로 도킹했을 때 1위 자세의 MCS-RMSD 중앙값은 5.78 Å, 2 Å 기준을 넘는 것은 </w:t>
+      </w:r>
+      <w:r>
+        <w:rPr>
+          <w:rFonts w:ascii="Malgun Gothic" w:hAnsi="Malgun Gothic"/>
+          <w:b/>
+          <w:sz w:val="21"/>
+        </w:rPr>
+        <w:t>6.9%</w:t>
+      </w:r>
+      <w:r>
+        <w:rPr>
+          <w:rFonts w:ascii="Malgun Gothic" w:hAnsi="Malgun Gothic"/>
+          <w:b w:val="0"/>
+          <w:sz w:val="21"/>
+        </w:rPr>
+        <w:t xml:space="preserve"> 로 통제 세트 전체의 19.0% 보다도 낮다. </w:t>
+      </w:r>
+      <w:r>
+        <w:rPr>
+          <w:rFonts w:ascii="Malgun Gothic" w:hAnsi="Malgun Gothic"/>
+          <w:b/>
+          <w:sz w:val="21"/>
+        </w:rPr>
+        <w:t>이 연구에서 가장 강한 상관이 자세가 가장 틀린 집합에서 나왔다.</w:t>
+      </w:r>
+      <w:r>
+        <w:rPr>
+          <w:rFonts w:ascii="Malgun Gothic" w:hAnsi="Malgun Gothic"/>
+          <w:b w:val="0"/>
+          <w:sz w:val="21"/>
+        </w:rPr>
+        <w:t xml:space="preserve"> 결합 기하에서 온 신호라면 나오기 어려운 조합이다.</w:t>
+      </w:r>
+    </w:p>
+    <w:p>
+      <w:r>
+        <w:rPr>
+          <w:rFonts w:ascii="Malgun Gothic" w:hAnsi="Malgun Gothic"/>
+          <w:b/>
+          <w:sz w:val="21"/>
+        </w:rPr>
+        <w:t>정리하면</w:t>
+      </w:r>
+      <w:r>
+        <w:rPr>
+          <w:rFonts w:ascii="Malgun Gothic" w:hAnsi="Malgun Gothic"/>
+          <w:b w:val="0"/>
+          <w:sz w:val="21"/>
+        </w:rPr>
+        <w:t xml:space="preserve"> — 붕괴의 원인은 화합물 집합이고, 골격 교란도 표본 설계도 프로토콜도 아니다. 그 30건의 어떤 성질이 상관을 만들었는지는 이 데이터로 더 좁히지 못한다. 이 절은 본 보고서 초안의 인과 주장(골격 교란)을 철회하고 그 자리에 검정 결과를 넣은 기록이다.</w:t>
       </w:r>
     </w:p>
     <w:p>
@@ -6736,7 +6939,7 @@
           <w:b/>
           <w:sz w:val="21"/>
         </w:rPr>
-        <w:t>Table 9. 1위 자세의 결정 자세 부합도.</w:t>
+        <w:t>Table 9. 1위 자세의 공결정 리간드 기준 부합도.</w:t>
       </w:r>
       <w:r>
         <w:rPr>
@@ -6744,7 +6947,41 @@
           <w:b w:val="0"/>
           <w:sz w:val="21"/>
         </w:rPr>
-        <w:t xml:space="preserve"> MCS 원자수가 하한 8개에 못 미치면 계산이 불가해 제외했다 (전체 163건 중 5건). 이 지표는 대칭 보정이 없는 단일 매핑 RMSD 이므로 대칭 분자에서 과대평가될 수 있다.</w:t>
+        <w:t xml:space="preserve"> MCS 원자수가 하한 8개에 못 미치면 계산이 불가해 제외했다 (전체 163건 중 5건). 대칭 보정이 없는 단일 매핑 RMSD 라 대칭 분자에서 과대평가될 수 있다.</w:t>
+      </w:r>
+    </w:p>
+    <w:p>
+      <w:r>
+        <w:rPr>
+          <w:rFonts w:ascii="Malgun Gothic" w:hAnsi="Malgun Gothic"/>
+          <w:b/>
+          <w:sz w:val="21"/>
+        </w:rPr>
+        <w:t>이 지표가 무엇을 재는지 분명히 해 둔다.</w:t>
+      </w:r>
+      <w:r>
+        <w:rPr>
+          <w:rFonts w:ascii="Malgun Gothic" w:hAnsi="Malgun Gothic"/>
+          <w:b w:val="0"/>
+          <w:sz w:val="21"/>
+        </w:rPr>
+        <w:t xml:space="preserve"> 실데나필 외의 화합물에는 실험 결정 자세가 없다. 따라서 이 값은 "자세가 맞는가"가 아니라 </w:t>
+      </w:r>
+      <w:r>
+        <w:rPr>
+          <w:rFonts w:ascii="Malgun Gothic" w:hAnsi="Malgun Gothic"/>
+          <w:b/>
+          <w:sz w:val="21"/>
+        </w:rPr>
+        <w:t>"공유 부분구조가 실데나필의 원자 위에 겹치는가"</w:t>
+      </w:r>
+      <w:r>
+        <w:rPr>
+          <w:rFonts w:ascii="Malgun Gothic" w:hAnsi="Malgun Gothic"/>
+          <w:b w:val="0"/>
+          <w:sz w:val="21"/>
+        </w:rPr>
+        <w:t xml:space="preserve"> 를 잰다. 같은 결합 양식을 전제하는 셈이므로, 골격이 다른 far 대역 (공유 원자 평균 약 10개)에서는 해석이 특히 약하다. 대역별로 읽어야 하고, 전체 통합값 19.0% 를 균일한 증거처럼 인용하면 안 된다.</w:t>
       </w:r>
     </w:p>
     <w:p>
@@ -7338,6 +7575,40 @@
       <w:r>
         <w:rPr>
           <w:rFonts w:ascii="Malgun Gothic" w:hAnsi="Malgun Gothic"/>
+          <w:b/>
+          <w:sz w:val="21"/>
+        </w:rPr>
+        <w:t>대역별 AUC 의 음성군은 각 대역의 weak 칸 하나로만 이루어진다.</w:t>
+      </w:r>
+      <w:r>
+        <w:rPr>
+          <w:rFonts w:ascii="Malgun Gothic" w:hAnsi="Malgun Gothic"/>
+          <w:b w:val="0"/>
+          <w:sz w:val="21"/>
+        </w:rPr>
+        <w:t xml:space="preserve"> near 대역의 경우 그 칸이 전수(census, 12/12)이므로 </w:t>
+      </w:r>
+      <w:r>
+        <w:rPr>
+          <w:rFonts w:ascii="Malgun Gothic" w:hAnsi="Malgun Gothic"/>
+          <w:b/>
+          <w:sz w:val="21"/>
+        </w:rPr>
+        <w:t>§3.4 에서 한 민감도 분석(그 칸 제거)을 AUC 에는 적용할 수 없다</w:t>
+      </w:r>
+      <w:r>
+        <w:rPr>
+          <w:rFonts w:ascii="Malgun Gothic" w:hAnsi="Malgun Gothic"/>
+          <w:b w:val="0"/>
+          <w:sz w:val="21"/>
+        </w:rPr>
+        <w:t xml:space="preserve"> — 제거하면 음성군이 0 이 된다. 즉 near AUC 0.792 는 그 12건에 전적으로 의존하며, 그 12건은 표본이 아니라 전수다 (§4.4 한계 11).</w:t>
+      </w:r>
+    </w:p>
+    <w:p>
+      <w:r>
+        <w:rPr>
+          <w:rFonts w:ascii="Malgun Gothic" w:hAnsi="Malgun Gothic"/>
           <w:b w:val="0"/>
           <w:sz w:val="21"/>
         </w:rPr>
@@ -9545,7 +9816,7 @@
           <w:b w:val="0"/>
           <w:sz w:val="21"/>
         </w:rPr>
-        <w:t xml:space="preserve"> 4.0 Å 이내 중원자 기준. 두 자세의 접촉 집합은 평균 Jaccard 0.619 로 서로 다른데도 핵심 잔기는 양쪽 모두 전 화합물에서 접촉한다. 해석은 §4.3 에서 다룬다.</w:t>
+        <w:t xml:space="preserve"> 4.0 Å 이내 중원자 기준. 두 자세의 접촉 집합은 평균 Jaccard 0.619 로 서로 다른데도 상위 잔기는 양쪽 모두에서 거의 전 화합물이 접촉한다 (전수인 것은 일부이고 나머지는 한두 건씩 빠진다 — 표의 실제 수를 보라). 해석은 §4.3 에서 다룬다.</w:t>
       </w:r>
     </w:p>
     <w:p>
@@ -9763,7 +10034,7 @@
           <w:b/>
           <w:sz w:val="21"/>
         </w:rPr>
-        <w:t>결정 구조와 같은 계열 안에서는 신호가 남는다</w:t>
+        <w:t>결정 구조와 같은 계열(near 대역) 안에서는 신호가 남는다</w:t>
       </w:r>
       <w:r>
         <w:rPr>
@@ -9771,7 +10042,23 @@
           <w:b w:val="0"/>
           <w:sz w:val="21"/>
         </w:rPr>
-        <w:t xml:space="preserve"> (near 대역 ρ = -0.397, p = 0.00365, AUC 0.792) — 채점 함수는 구조가 유래한 화학형 안에서만 작동한다.</w:t>
+        <w:t xml:space="preserve"> (ρ = -0.397, p = 0.00365, AUC 0.792). </w:t>
+      </w:r>
+      <w:r>
+        <w:rPr>
+          <w:rFonts w:ascii="Malgun Gothic" w:hAnsi="Malgun Gothic"/>
+          <w:b/>
+          <w:sz w:val="21"/>
+        </w:rPr>
+        <w:t>이 결과는 가설로만 남긴다</w:t>
+      </w:r>
+      <w:r>
+        <w:rPr>
+          <w:rFonts w:ascii="Malgun Gothic" w:hAnsi="Malgun Gothic"/>
+          <w:b w:val="0"/>
+          <w:sz w:val="21"/>
+        </w:rPr>
+        <w:t xml:space="preserve"> — 그 대역의 약한 화합물 12건이 전수(census)이고 어세이 바닥값에 몰려 있어, 그 칸을 빼면 상관이 유의하지 않고 AUC 는 계산조차 되지 않는다.</w:t>
       </w:r>
     </w:p>
     <w:p>
@@ -9805,7 +10092,7 @@
           <w:b w:val="0"/>
           <w:sz w:val="21"/>
         </w:rPr>
-        <w:t xml:space="preserve"> — 즉 </w:t>
+        <w:t xml:space="preserve"> — 즉 닮을수록 점수가 나쁜 방향이다. </w:t>
       </w:r>
       <w:r>
         <w:rPr>
@@ -9813,7 +10100,7 @@
           <w:b/>
           <w:sz w:val="21"/>
         </w:rPr>
-        <w:t>닮을수록 점수가 나쁘다.</w:t>
+        <w:t>다만 이 상관은 유의하지 않다</w:t>
       </w:r>
       <w:r>
         <w:rPr>
@@ -9821,7 +10108,7 @@
           <w:b w:val="0"/>
           <w:sz w:val="21"/>
         </w:rPr>
-        <w:t xml:space="preserve"> 대역별 평균 점수도 far -10.20 · mid -9.63 · near -9.99 kcal/mol 로 가장 안 닮은 대역이 가장 좋은 점수를 받는다. 점수 상위 16건의 대역 구성은 far 11 · mid 1 · near 4 로, 무작위 기대(각 약 5.3건) 대비 far 가 뚜렷이 과대표집된다.</w:t>
+        <w:t xml:space="preserve"> (순열 p=0.15809). 대역별 평균 점수는 far -10.20 · mid -9.63 · near -9.99 kcal/mol 이지만, far−near 차이 -0.215 kcal/mol 역시 유의하지 않다 (p=0.1799).</w:t>
       </w:r>
     </w:p>
     <w:p>
@@ -9831,7 +10118,7 @@
           <w:b/>
           <w:sz w:val="21"/>
         </w:rPr>
-        <w:t>분자 크기로는 설명되지 않는다.</w:t>
+        <w:t>유의한 것은 하나뿐이다.</w:t>
       </w:r>
       <w:r>
         <w:rPr>
@@ -9839,7 +10126,7 @@
           <w:b w:val="0"/>
           <w:sz w:val="21"/>
         </w:rPr>
-        <w:t xml:space="preserve"> Vina 계열 점수는 크기에 반응하고 (점수-중원자수 -0.342), 크면 점수가 좋아진다. 그런데 near 대역이 오히려 더 큰 분자로 이루어져 있다. 크기 효과만 있었다면 near 가 좋은 점수를 받아야 하는데 그 반대다.</w:t>
+        <w:t xml:space="preserve"> 점수 상위 16건의 대역 구성 far 11 · mid 1 · near 4 는 귀무 기대값과 어긋난다. 대역 크기가 다르므로 기대값은 각 5.3건이 아니라 far 5.89 · mid 5.01 · near 5.1 이고, far 의 과대표집은 이항검정 p≈0.01 이다.</w:t>
       </w:r>
     </w:p>
     <w:p>
@@ -9849,7 +10136,7 @@
           <w:b/>
           <w:sz w:val="21"/>
         </w:rPr>
-        <w:t>따라서 우리는 이 방향의 기전을 특정하지 못한다.</w:t>
+        <w:t>다른 곳에서 p=0.32 를 "신호 없음"이라 했으므로 여기서도 같은 기준을 적용한다</w:t>
       </w:r>
       <w:r>
         <w:rPr>
@@ -9857,15 +10144,7 @@
           <w:b w:val="0"/>
           <w:sz w:val="21"/>
         </w:rPr>
-        <w:t xml:space="preserve"> 관찰만 적는다 — 이 표적·이 구조에서 채점 함수는 공결정 리간드와 닮지 않은 분자에 더 좋은 점수를 준다. 자세 타당도(§3.6)를 보면 far 대역은 결정 자세 틀 안에 놓이는 비율이 1.8% 에 불과하므로, "닮지 않은 분자가 상자 안에서 접촉을 최대화하는 임의 자세를 찾아 좋은 점수를 얻는다"는 설명이 가능하지만 </w:t>
-      </w:r>
-      <w:r>
-        <w:rPr>
-          <w:rFonts w:ascii="Malgun Gothic" w:hAnsi="Malgun Gothic"/>
-          <w:b/>
-          <w:sz w:val="21"/>
-        </w:rPr>
-        <w:t>검정하지 않았다.</w:t>
+        <w:t xml:space="preserve"> — 이 절에서 통계적으로 뒷받침되는 관찰은 상위권의 far 과대표집 하나뿐이고, 나머지는 방향만 보여준다.</w:t>
       </w:r>
     </w:p>
     <w:p>
@@ -9875,17 +10154,33 @@
           <w:b/>
           <w:sz w:val="21"/>
         </w:rPr>
-        <w:t>이 보고의 기여는 기전 설명이 아니라 두 가지 음성 결과다.</w:t>
+        <w:t>분자 크기로는 설명되지 않는다.</w:t>
+      </w:r>
+      <w:r>
+        <w:rPr>
+          <w:rFonts w:ascii="Malgun Gothic" w:hAnsi="Malgun Gothic"/>
+          <w:b w:val="0"/>
+          <w:sz w:val="21"/>
+        </w:rPr>
+        <w:t xml:space="preserve"> Vina 계열 점수는 크기에 반응하고 (점수-중원자수 -0.342), 크면 점수가 좋아진다. 그런데 near 대역이 오히려 더 큰 분자로 이루어져 있다. 크기 효과만 있었다면 near 가 좋은 점수를 받아야 하는데 그 반대다.</w:t>
       </w:r>
     </w:p>
     <w:p>
       <w:r>
         <w:rPr>
           <w:rFonts w:ascii="Malgun Gothic" w:hAnsi="Malgun Gothic"/>
+          <w:b/>
+          <w:sz w:val="21"/>
+        </w:rPr>
+        <w:t>따라서 우리는 이 방향의 기전을 특정하지 못한다.</w:t>
+      </w:r>
+      <w:r>
+        <w:rPr>
+          <w:rFonts w:ascii="Malgun Gothic" w:hAnsi="Malgun Gothic"/>
           <w:b w:val="0"/>
           <w:sz w:val="21"/>
         </w:rPr>
-        <w:t xml:space="preserve">첫째, </w:t>
+        <w:t xml:space="preserve"> 관찰만 적는다 — 이 표적·이 구조에서 채점 함수는 공결정 리간드와 닮지 않은 분자에 더 좋은 점수를 준다. 자세 타당도(§3.6)를 보면 far 대역은 결정 자세 틀 안에 놓이는 비율이 1.8% 에 불과하므로, "닮지 않은 분자가 상자 안에서 접촉을 최대화하는 임의 자세를 찾아 좋은 점수를 얻는다"는 설명이 가능하지만 </w:t>
       </w:r>
       <w:r>
         <w:rPr>
@@ -9893,50 +10188,94 @@
           <w:b/>
           <w:sz w:val="21"/>
         </w:rPr>
-        <w:t>더 크고 골격을 통제한 표본에서 도킹 점수는 역가와 관계가 없다</w:t>
-      </w:r>
-      <w:r>
-        <w:rPr>
-          <w:rFonts w:ascii="Malgun Gothic" w:hAnsi="Malgun Gothic"/>
-          <w:b w:val="0"/>
-          <w:sz w:val="21"/>
-        </w:rPr>
-        <w:t xml:space="preserve"> (ρ=-0.079, 95% CI -0.230–+0.076). 단 이 "없다"는 검정력 한계 안에서의 진술이며 |ρ| ≲ 0.218 인 관계는 배제하지 못한다 (§4.4 한계 9).</w:t>
+        <w:t>검정하지 않았다.</w:t>
       </w:r>
     </w:p>
     <w:p>
       <w:r>
         <w:rPr>
           <w:rFonts w:ascii="Malgun Gothic" w:hAnsi="Malgun Gothic"/>
-          <w:b w:val="0"/>
-          <w:sz w:val="21"/>
-        </w:rPr>
-        <w:t xml:space="preserve">둘째, </w:t>
-      </w:r>
-      <w:r>
-        <w:rPr>
-          <w:rFonts w:ascii="Malgun Gothic" w:hAnsi="Malgun Gothic"/>
           <w:b/>
           <w:sz w:val="21"/>
         </w:rPr>
-        <w:t>n=30 에서 얻었던 ρ=-0.538 는 재현되지 않았고, 그 이유로 우리가 처음 제시한 설명(골격 교란)은 검정 결과 틀렸다</w:t>
-      </w:r>
-      <w:r>
-        <w:rPr>
-          <w:rFonts w:ascii="Malgun Gothic" w:hAnsi="Malgun Gothic"/>
-          <w:b w:val="0"/>
-          <w:sz w:val="21"/>
-        </w:rPr>
-        <w:t xml:space="preserve"> (§3.5). 설계 재현 실험도 그 차이를 만들지 못했다. 남은 후보는 화합물 집합과 프로토콜 차이이며 이 데이터로는 나눌 수 없다.</w:t>
+        <w:t>이 보고의 기여는 기전 설명이 아니라 두 가지 음성 결과다.</w:t>
       </w:r>
     </w:p>
     <w:p>
       <w:r>
         <w:rPr>
           <w:rFonts w:ascii="Malgun Gothic" w:hAnsi="Malgun Gothic"/>
+          <w:b w:val="0"/>
+          <w:sz w:val="21"/>
+        </w:rPr>
+        <w:t xml:space="preserve">첫째, </w:t>
+      </w:r>
+      <w:r>
+        <w:rPr>
+          <w:rFonts w:ascii="Malgun Gothic" w:hAnsi="Malgun Gothic"/>
           <w:b/>
           <w:sz w:val="21"/>
         </w:rPr>
+        <w:t>더 크고 골격을 통제한 표본에서 도킹 점수는 역가와 관계가 없다</w:t>
+      </w:r>
+      <w:r>
+        <w:rPr>
+          <w:rFonts w:ascii="Malgun Gothic" w:hAnsi="Malgun Gothic"/>
+          <w:b w:val="0"/>
+          <w:sz w:val="21"/>
+        </w:rPr>
+        <w:t xml:space="preserve"> (ρ=-0.079, 95% CI -0.230–+0.076). 단 이 "없다"는 검정력 한계 안에서의 진술이며 |ρ| ≲ 0.218 인 관계는 배제하지 못한다 (§4.4 한계 9).</w:t>
+      </w:r>
+    </w:p>
+    <w:p>
+      <w:r>
+        <w:rPr>
+          <w:rFonts w:ascii="Malgun Gothic" w:hAnsi="Malgun Gothic"/>
+          <w:b w:val="0"/>
+          <w:sz w:val="21"/>
+        </w:rPr>
+        <w:t xml:space="preserve">둘째, </w:t>
+      </w:r>
+      <w:r>
+        <w:rPr>
+          <w:rFonts w:ascii="Malgun Gothic" w:hAnsi="Malgun Gothic"/>
+          <w:b/>
+          <w:sz w:val="21"/>
+        </w:rPr>
+        <w:t>n=30 에서 얻었던 ρ=-0.538 는 재현되지 않았고, 그 이유로 우리가 처음 제시한 설명(골격 교란)은 검정 결과 틀렸다</w:t>
+      </w:r>
+      <w:r>
+        <w:rPr>
+          <w:rFonts w:ascii="Malgun Gothic" w:hAnsi="Malgun Gothic"/>
+          <w:b w:val="0"/>
+          <w:sz w:val="21"/>
+        </w:rPr>
+        <w:t xml:space="preserve"> (§3.5). 설계 재현도 프로토콜도 원인이 아니었다 — 옛 30건을 새 프로토콜로 다시 도킹하면 상관이 -0.527 로 그대로 유지된다(점수 상관 +0.997). </w:t>
+      </w:r>
+      <w:r>
+        <w:rPr>
+          <w:rFonts w:ascii="Malgun Gothic" w:hAnsi="Malgun Gothic"/>
+          <w:b/>
+          <w:sz w:val="21"/>
+        </w:rPr>
+        <w:t>원인은 그 화합물 집합 자체다.</w:t>
+      </w:r>
+      <w:r>
+        <w:rPr>
+          <w:rFonts w:ascii="Malgun Gothic" w:hAnsi="Malgun Gothic"/>
+          <w:b w:val="0"/>
+          <w:sz w:val="21"/>
+        </w:rPr>
+        <w:t xml:space="preserve"> 어떤 성질 때문인지는 더 좁히지 못했으나, 그 집합의 자세 타당도가 6.9% 로 통제 세트 전체보다도 낮다는 사실은 그 상관이 결합 기하에서 온 것이 아닐 가능성을 시사한다.</w:t>
+      </w:r>
+    </w:p>
+    <w:p>
+      <w:r>
+        <w:rPr>
+          <w:rFonts w:ascii="Malgun Gothic" w:hAnsi="Malgun Gothic"/>
+          <w:b/>
+          <w:sz w:val="21"/>
+        </w:rPr>
         <w:t>따라서 "골격 유사성을 통제하라"는 처방은 이 연구가 입증한 것이 아니다.</w:t>
       </w:r>
       <w:r>
@@ -9953,7 +10292,7 @@
           <w:b/>
           <w:sz w:val="21"/>
         </w:rPr>
-        <w:t>본 연구에서 통제가 결과를 바꾼 몫은 옛 데이터 기준 0.8% 로 거의 0 이었다.</w:t>
+        <w:t>본 연구에서 통제가 결과를 바꾼 몫은 옛 데이터 기준 1.2% 로 거의 0 이었다.</w:t>
       </w:r>
       <w:r>
         <w:rPr>
@@ -10087,7 +10426,23 @@
           <w:b w:val="0"/>
           <w:sz w:val="21"/>
         </w:rPr>
-        <w:t xml:space="preserve"> 80% 검정력에서 검출 가능한 최소 |ρ| 은 전체 0.218 · far 0.355 · mid 0.383 · near 0.38 · near AUC 0.478 다. far·mid 대역의    "신호 없음"은 </w:t>
+        <w:t xml:space="preserve"> 80% 검정력에서 검출 가능한 최소 |ρ| 은 전체 0.218 · far 0.355 · mid 0.383 · near 0.38 · near 대역 강/약 부분집합(n=32) 0.478 다 (</w:t>
+      </w:r>
+      <w:r>
+        <w:rPr>
+          <w:rFonts w:ascii="Malgun Gothic" w:hAnsi="Malgun Gothic"/>
+          <w:b/>
+          <w:sz w:val="21"/>
+        </w:rPr>
+        <w:t>모두 ρ    척도이며 AUC 척도가 아니다</w:t>
+      </w:r>
+      <w:r>
+        <w:rPr>
+          <w:rFonts w:ascii="Malgun Gothic" w:hAnsi="Malgun Gothic"/>
+          <w:b w:val="0"/>
+          <w:sz w:val="21"/>
+        </w:rPr>
+        <w:t xml:space="preserve"> — AUC 기준 0.7 에 대한 검출력은 별도로 계산하지 않았다). far·mid 대역의    "신호 없음"은 </w:t>
       </w:r>
       <w:r>
         <w:rPr>
@@ -10283,7 +10638,7 @@
           <w:b/>
           <w:sz w:val="21"/>
         </w:rPr>
-        <w:t>결정 구조와 같은 계열 안에서는 신호가 남는다</w:t>
+        <w:t>결정 구조와 같은 계열(near 대역) 안에서는 신호가 남는다</w:t>
       </w:r>
       <w:r>
         <w:rPr>
@@ -10291,7 +10646,23 @@
           <w:b w:val="0"/>
           <w:sz w:val="21"/>
         </w:rPr>
-        <w:t xml:space="preserve"> (near 대역 ρ = -0.397, p = 0.00365, AUC 0.792) — 채점 함수는 구조가 유래한 화학형 안에서만 작동한다.</w:t>
+        <w:t xml:space="preserve"> (ρ = -0.397, p = 0.00365, AUC 0.792). </w:t>
+      </w:r>
+      <w:r>
+        <w:rPr>
+          <w:rFonts w:ascii="Malgun Gothic" w:hAnsi="Malgun Gothic"/>
+          <w:b/>
+          <w:sz w:val="21"/>
+        </w:rPr>
+        <w:t>이 결과는 가설로만 남긴다</w:t>
+      </w:r>
+      <w:r>
+        <w:rPr>
+          <w:rFonts w:ascii="Malgun Gothic" w:hAnsi="Malgun Gothic"/>
+          <w:b w:val="0"/>
+          <w:sz w:val="21"/>
+        </w:rPr>
+        <w:t xml:space="preserve"> — 그 대역의 약한 화합물 12건이 전수(census)이고 어세이 바닥값에 몰려 있어, 그 칸을 빼면 상관이 유의하지 않고 AUC 는 계산조차 되지 않는다.</w:t>
       </w:r>
     </w:p>
     <w:p>
@@ -10421,7 +10792,7 @@
           <w:b/>
           <w:sz w:val="21"/>
         </w:rPr>
-        <w:t>검정해 보니 아니었다</w:t>
+        <w:t>검정해 보니 아니었다.</w:t>
       </w:r>
       <w:r>
         <w:rPr>
@@ -10429,7 +10800,7 @@
           <w:b w:val="0"/>
           <w:sz w:val="21"/>
         </w:rPr>
-        <w:t xml:space="preserve"> (§3.5)</w:t>
+        <w:t xml:space="preserve"> 골격도, 설계도,   프로토콜도 아니고 화합물 집합이었다 (§3.5)</w:t>
       </w:r>
     </w:p>
     <w:p>
@@ -11457,6 +11828,68 @@
                 <w:sz w:val="17"/>
               </w:rPr>
               <w:t>옛 데이터 편상관 · 설계 재현 추출 · 표본크기 대조</w:t>
+            </w:r>
+          </w:p>
+        </w:tc>
+        <w:tc>
+          <w:tcPr>
+            <w:tcW w:type="dxa" w:w="2160"/>
+          </w:tcPr>
+          <w:p>
+            <w:r>
+              <w:rPr>
+                <w:rFonts w:ascii="Malgun Gothic" w:hAnsi="Malgun Gothic"/>
+                <w:b w:val="0"/>
+                <w:sz w:val="17"/>
+              </w:rPr>
+              <w:t>PASS</w:t>
+            </w:r>
+          </w:p>
+        </w:tc>
+      </w:tr>
+      <w:tr>
+        <w:tc>
+          <w:tcPr>
+            <w:tcW w:type="dxa" w:w="2160"/>
+          </w:tcPr>
+          <w:p>
+            <w:r>
+              <w:rPr>
+                <w:rFonts w:ascii="Malgun Gothic" w:hAnsi="Malgun Gothic"/>
+                <w:b w:val="0"/>
+                <w:sz w:val="17"/>
+              </w:rPr>
+              <w:t>옛 세트 재도킹 (프로토콜 대조)</w:t>
+            </w:r>
+          </w:p>
+        </w:tc>
+        <w:tc>
+          <w:tcPr>
+            <w:tcW w:type="dxa" w:w="2160"/>
+          </w:tcPr>
+          <w:p>
+            <w:r>
+              <w:rPr>
+                <w:rFonts w:ascii="Malgun Gothic" w:hAnsi="Malgun Gothic"/>
+                <w:b w:val="0"/>
+                <w:sz w:val="17"/>
+              </w:rPr>
+              <w:t>old_set_new_protocol.json</w:t>
+            </w:r>
+          </w:p>
+        </w:tc>
+        <w:tc>
+          <w:tcPr>
+            <w:tcW w:type="dxa" w:w="2160"/>
+          </w:tcPr>
+          <w:p>
+            <w:r>
+              <w:rPr>
+                <w:rFonts w:ascii="Malgun Gothic" w:hAnsi="Malgun Gothic"/>
+                <w:b w:val="0"/>
+                <w:sz w:val="17"/>
+              </w:rPr>
+              <w:t>동일 화합물 · 두 프로토콜 점수 · 자세 타당도</w:t>
             </w:r>
           </w:p>
         </w:tc>
@@ -11631,7 +12064,7 @@
           <w:b w:val="0"/>
           <w:sz w:val="21"/>
         </w:rPr>
-        <w:t xml:space="preserve"> — v2.0 의 긍정적 선별 결론이 </w:t>
+        <w:t xml:space="preserve"> — v2.0 의 표본에서 역가와 골격이 얽혀 있다는 </w:t>
       </w:r>
       <w:r>
         <w:rPr>
@@ -11639,7 +12072,7 @@
           <w:b/>
           <w:sz w:val="21"/>
         </w:rPr>
-        <w:t>골격 교란으로 해석 불가능</w:t>
+        <w:t>우려</w:t>
       </w:r>
       <w:r>
         <w:rPr>
@@ -11647,7 +12080,23 @@
           <w:b w:val="0"/>
           <w:sz w:val="21"/>
         </w:rPr>
-        <w:t>함을 확인. 강함 층은 공결정 리간드 유사 골격(MCS 평균 16.6원자)이 주도하고 약함 층은 무관한 골격(9.4원자)이었으며, 수용체가 그 리간드의 holo 구조였다. 다음을 새로 했다.</w:t>
+        <w:t xml:space="preserve">에 따라 재설계했다 (강함 층은 공결정 리간드 유사 골격이 주도하고 약함 층은 무관한 골격이었으며 수용체가 그 리간드의 holo 구조였다). </w:t>
+      </w:r>
+      <w:r>
+        <w:rPr>
+          <w:rFonts w:ascii="Malgun Gothic" w:hAnsi="Malgun Gothic"/>
+          <w:b/>
+          <w:sz w:val="21"/>
+        </w:rPr>
+        <w:t>그 우려가 실제로 v2.0 의 상관을 만들었는지는 검정 대상이었고, 검정 결과 아니었다</w:t>
+      </w:r>
+      <w:r>
+        <w:rPr>
+          <w:rFonts w:ascii="Malgun Gothic" w:hAnsi="Malgun Gothic"/>
+          <w:b w:val="0"/>
+          <w:sz w:val="21"/>
+        </w:rPr>
+        <w:t xml:space="preserve"> (§3.5, 개정 항목 7). 다음을 새로 했다.</w:t>
       </w:r>
     </w:p>
     <w:p>
@@ -11737,7 +12186,7 @@
           <w:b w:val="0"/>
           <w:sz w:val="21"/>
         </w:rPr>
-        <w:t xml:space="preserve"> — 도구 기본 동작에 맡기던 단계를 코드로. 5b. </w:t>
+        <w:t xml:space="preserve"> — 도구 기본 동작에 맡기던 단계를 코드로. 6. </w:t>
       </w:r>
       <w:r>
         <w:rPr>
@@ -11769,7 +12218,7 @@
           <w:b w:val="0"/>
           <w:sz w:val="21"/>
         </w:rPr>
-        <w:t xml:space="preserve"> — 초안은 v1/v2 의 상관을 골격 교란의 산물로 설명했다. 외부    비평 리뷰가 그 설명을 검정하라고 요구했고, 검정 결과 옛 데이터에서 골격 통제의 감쇠는    0.8% 에 불과했다. 해당 주장을    철회하고 §3.5 에 검정 기록으로 대체했다. 8. </w:t>
+        <w:t xml:space="preserve"> — 초안은 v1/v2 의 상관을 골격 교란의 산물로 설명했다. 외부    비평 리뷰가 그 설명을 검정하라고 요구했고, 검정 결과 옛 데이터에서 골격 통제의 감쇠는    1.2% 에 불과했다. 해당 주장을    철회하고 §3.5 에 검정 기록으로 대체했다. 8. </w:t>
       </w:r>
       <w:r>
         <w:rPr>
@@ -11801,7 +12250,7 @@
           <w:b w:val="0"/>
           <w:sz w:val="21"/>
         </w:rPr>
-        <w:t xml:space="preserve"> — AUC 신뢰구간, 다중비교 보정, 최소검출효과, near 대역 민감도,    대역별 교란 통제를 추가했다. 모두 초안에 없던 것이며 일부는 결론을 약화시킨다. 6. </w:t>
+        <w:t xml:space="preserve"> — AUC 신뢰구간, 다중비교 보정, 최소검출효과, near 대역 민감도,    대역별 교란 통제를 추가했다. 모두 초안에 없던 것이며 일부는 결론을 약화시킨다. 10. </w:t>
       </w:r>
       <w:r>
         <w:rPr>
@@ -11809,7 +12258,7 @@
           <w:b/>
           <w:sz w:val="21"/>
         </w:rPr>
-        <w:t>전 그림 재생성</w:t>
+        <w:t>프로토콜 대조 실행</w:t>
       </w:r>
       <w:r>
         <w:rPr>
@@ -11817,7 +12266,55 @@
           <w:b w:val="0"/>
           <w:sz w:val="21"/>
         </w:rPr>
-        <w:t xml:space="preserve"> — 본문이 바뀌면 그림도 바뀌어야 한다.</w:t>
+        <w:t xml:space="preserve"> — 2차 리뷰가 "옛 30건을 새 프로토콜로 다시 돌리면 원인을 가를    수 있다"고 지적했고, 실제로 돌렸다 (§3.5 검정 ⑤). 점수 상관    +0.997 로 프로토콜은 원인이 아님이 확정됐다. 11. </w:t>
+      </w:r>
+      <w:r>
+        <w:rPr>
+          <w:rFonts w:ascii="Malgun Gothic" w:hAnsi="Malgun Gothic"/>
+          <w:b/>
+          <w:sz w:val="21"/>
+        </w:rPr>
+        <w:t>§4.2 의 관찰에 검정 추가</w:t>
+      </w:r>
+      <w:r>
+        <w:rPr>
+          <w:rFonts w:ascii="Malgun Gothic" w:hAnsi="Malgun Gothic"/>
+          <w:b w:val="0"/>
+          <w:sz w:val="21"/>
+        </w:rPr>
+        <w:t xml:space="preserve"> — 점수-Tanimoto 상관과 대역별 평균 점수 차이에 순열 p 를    붙였더니 둘 다 유의하지 않았다. 다른 곳에서 p=0.32 를 "신호 없음"이라 했으므로 같은    기준을 적용해 서술을 낮췄다. 12. </w:t>
+      </w:r>
+      <w:r>
+        <w:rPr>
+          <w:rFonts w:ascii="Malgun Gothic" w:hAnsi="Malgun Gothic"/>
+          <w:b/>
+          <w:sz w:val="21"/>
+        </w:rPr>
+        <w:t>near 대역 결과의 격하</w:t>
+      </w:r>
+      <w:r>
+        <w:rPr>
+          <w:rFonts w:ascii="Malgun Gothic" w:hAnsi="Malgun Gothic"/>
+          <w:b w:val="0"/>
+          <w:sz w:val="21"/>
+        </w:rPr>
+        <w:t xml:space="preserve"> — 그 대역의 AUC 음성군이 전수 칸 하나로만 이루어져 민감도    분석 자체가 불가능함을 확인하고, 초록·§4.2 의 문장을 가설로 낮췄다. 13. </w:t>
+      </w:r>
+      <w:r>
+        <w:rPr>
+          <w:rFonts w:ascii="Malgun Gothic" w:hAnsi="Malgun Gothic"/>
+          <w:b/>
+          <w:sz w:val="21"/>
+        </w:rPr>
+        <w:t>전 그림·문서 재생성</w:t>
+      </w:r>
+      <w:r>
+        <w:rPr>
+          <w:rFonts w:ascii="Malgun Gothic" w:hAnsi="Malgun Gothic"/>
+          <w:b w:val="0"/>
+          <w:sz w:val="21"/>
+        </w:rPr>
+        <w:t xml:space="preserve"> — 본문이 바뀌면 그림과 배포 문서도 바뀌어야 한다.    이 판에서는 Figure 14 의 v2.0 설명이 철회된 인과 주장을 그대로 담고 있던 것도 함께    고쳤다 — 2차 리뷰가 잡았고, 같은 유형(본문은 고치고 그림은 두는)이 세 번째 재발이었다.</w:t>
       </w:r>
     </w:p>
     <w:p>

</xml_diff>